<commit_message>
refactor+chore: decompose god-files, DI, tests, sandbox, CI; untrack .venvс/logs
</commit_message>
<xml_diff>
--- a/JARVIS_analysis.docx
+++ b/JARVIS_analysis.docx
@@ -1837,6 +1837,799 @@
     </w:p>
     <w:p>
       <w:pPr>
+        <w:spacing w:before="240" w:after="120"/>
+      </w:pPr>
+      <w:r>
+        <w:rPr>
+          <w:b/>
+          <w:color w:val="1F4E79"/>
+          <w:sz w:val="30"/>
+        </w:rPr>
+        <w:t>Фінал: декомпозиція хендлерів і сервера + DI-контейнер</w:t>
+      </w:r>
+    </w:p>
+    <w:p>
+      <w:pPr>
+        <w:spacing w:after="120"/>
+      </w:pPr>
+      <w:r>
+        <w:rPr>
+          <w:b w:val="0"/>
+          <w:i w:val="0"/>
+          <w:sz w:val="22"/>
+        </w:rPr>
+        <w:t>Після плану рефакторингу обидва god-файли, що лишалися, розкладено, а перший крок до явного впровадження залежностей зроблено. Поточний стан вузлів:</w:t>
+      </w:r>
+    </w:p>
+    <w:tbl>
+      <w:tblPr>
+        <w:tblStyle w:val="TableGrid"/>
+        <w:tblW w:type="auto" w:w="0"/>
+        <w:jc w:val="left"/>
+        <w:tblLook w:firstColumn="1" w:firstRow="1" w:lastColumn="0" w:lastRow="0" w:noHBand="0" w:noVBand="1" w:val="04A0"/>
+      </w:tblPr>
+      <w:tblGrid>
+        <w:gridCol w:w="2880"/>
+        <w:gridCol w:w="2880"/>
+        <w:gridCol w:w="2880"/>
+      </w:tblGrid>
+      <w:tr>
+        <w:tc>
+          <w:tcPr>
+            <w:tcW w:type="dxa" w:w="4320"/>
+            <w:shd w:val="clear" w:color="auto" w:fill="1F4E79"/>
+          </w:tcPr>
+          <w:p>
+            <w:pPr>
+              <w:spacing w:after="40"/>
+            </w:pPr>
+            <w:r/>
+            <w:r>
+              <w:rPr>
+                <w:b/>
+                <w:color w:val="FFFFFF"/>
+                <w:sz w:val="19"/>
+              </w:rPr>
+              <w:t>Файл / пакет</w:t>
+            </w:r>
+          </w:p>
+        </w:tc>
+        <w:tc>
+          <w:tcPr>
+            <w:tcW w:type="dxa" w:w="1728"/>
+            <w:shd w:val="clear" w:color="auto" w:fill="1F4E79"/>
+          </w:tcPr>
+          <w:p>
+            <w:pPr>
+              <w:spacing w:after="40"/>
+            </w:pPr>
+            <w:r/>
+            <w:r>
+              <w:rPr>
+                <w:b/>
+                <w:color w:val="FFFFFF"/>
+                <w:sz w:val="19"/>
+              </w:rPr>
+              <w:t>Було</w:t>
+            </w:r>
+          </w:p>
+        </w:tc>
+        <w:tc>
+          <w:tcPr>
+            <w:tcW w:type="dxa" w:w="4320"/>
+            <w:shd w:val="clear" w:color="auto" w:fill="1F4E79"/>
+          </w:tcPr>
+          <w:p>
+            <w:pPr>
+              <w:spacing w:after="40"/>
+            </w:pPr>
+            <w:r/>
+            <w:r>
+              <w:rPr>
+                <w:b/>
+                <w:color w:val="FFFFFF"/>
+                <w:sz w:val="19"/>
+              </w:rPr>
+              <w:t>Стало</w:t>
+            </w:r>
+          </w:p>
+        </w:tc>
+      </w:tr>
+      <w:tr>
+        <w:tc>
+          <w:tcPr>
+            <w:tcW w:type="dxa" w:w="4320"/>
+          </w:tcPr>
+          <w:p>
+            <w:pPr>
+              <w:spacing w:after="40"/>
+            </w:pPr>
+            <w:r/>
+            <w:r>
+              <w:rPr>
+                <w:sz w:val="19"/>
+              </w:rPr>
+              <w:t>main.py</w:t>
+            </w:r>
+          </w:p>
+        </w:tc>
+        <w:tc>
+          <w:tcPr>
+            <w:tcW w:type="dxa" w:w="1728"/>
+          </w:tcPr>
+          <w:p>
+            <w:pPr>
+              <w:spacing w:after="40"/>
+            </w:pPr>
+            <w:r/>
+            <w:r>
+              <w:rPr>
+                <w:sz w:val="19"/>
+              </w:rPr>
+              <w:t>754 рядки</w:t>
+            </w:r>
+          </w:p>
+        </w:tc>
+        <w:tc>
+          <w:tcPr>
+            <w:tcW w:type="dxa" w:w="4320"/>
+          </w:tcPr>
+          <w:p>
+            <w:pPr>
+              <w:spacing w:after="40"/>
+            </w:pPr>
+            <w:r/>
+            <w:r>
+              <w:rPr>
+                <w:sz w:val="19"/>
+              </w:rPr>
+              <w:t>439 — тонкий оркестратор</w:t>
+            </w:r>
+          </w:p>
+        </w:tc>
+      </w:tr>
+      <w:tr>
+        <w:tc>
+          <w:tcPr>
+            <w:tcW w:type="dxa" w:w="4320"/>
+          </w:tcPr>
+          <w:p>
+            <w:pPr>
+              <w:spacing w:after="40"/>
+            </w:pPr>
+            <w:r/>
+            <w:r>
+              <w:rPr>
+                <w:sz w:val="19"/>
+              </w:rPr>
+              <w:t>core/handlers/command_handlers.py</w:t>
+            </w:r>
+          </w:p>
+        </w:tc>
+        <w:tc>
+          <w:tcPr>
+            <w:tcW w:type="dxa" w:w="1728"/>
+          </w:tcPr>
+          <w:p>
+            <w:pPr>
+              <w:spacing w:after="40"/>
+            </w:pPr>
+            <w:r/>
+            <w:r>
+              <w:rPr>
+                <w:sz w:val="19"/>
+              </w:rPr>
+              <w:t>824 рядки</w:t>
+            </w:r>
+          </w:p>
+        </w:tc>
+        <w:tc>
+          <w:tcPr>
+            <w:tcW w:type="dxa" w:w="4320"/>
+          </w:tcPr>
+          <w:p>
+            <w:pPr>
+              <w:spacing w:after="40"/>
+            </w:pPr>
+            <w:r/>
+            <w:r>
+              <w:rPr>
+                <w:sz w:val="19"/>
+              </w:rPr>
+              <w:t>43 — фасад над 7 доменними міксинами</w:t>
+            </w:r>
+          </w:p>
+        </w:tc>
+      </w:tr>
+      <w:tr>
+        <w:tc>
+          <w:tcPr>
+            <w:tcW w:type="dxa" w:w="4320"/>
+          </w:tcPr>
+          <w:p>
+            <w:pPr>
+              <w:spacing w:after="40"/>
+            </w:pPr>
+            <w:r/>
+            <w:r>
+              <w:rPr>
+                <w:sz w:val="19"/>
+              </w:rPr>
+              <w:t>server.py</w:t>
+            </w:r>
+          </w:p>
+        </w:tc>
+        <w:tc>
+          <w:tcPr>
+            <w:tcW w:type="dxa" w:w="1728"/>
+          </w:tcPr>
+          <w:p>
+            <w:pPr>
+              <w:spacing w:after="40"/>
+            </w:pPr>
+            <w:r/>
+            <w:r>
+              <w:rPr>
+                <w:sz w:val="19"/>
+              </w:rPr>
+              <w:t>739 рядків</w:t>
+            </w:r>
+          </w:p>
+        </w:tc>
+        <w:tc>
+          <w:tcPr>
+            <w:tcW w:type="dxa" w:w="4320"/>
+          </w:tcPr>
+          <w:p>
+            <w:pPr>
+              <w:spacing w:after="40"/>
+            </w:pPr>
+            <w:r/>
+            <w:r>
+              <w:rPr>
+                <w:sz w:val="19"/>
+              </w:rPr>
+              <w:t>31 — точка входу; логіка у пакеті webapp/</w:t>
+            </w:r>
+          </w:p>
+        </w:tc>
+      </w:tr>
+    </w:tbl>
+    <w:p>
+      <w:pPr>
+        <w:spacing w:after="80"/>
+      </w:pPr>
+      <w:r>
+        <w:rPr>
+          <w:b w:val="0"/>
+          <w:i w:val="0"/>
+          <w:sz w:val="22"/>
+        </w:rPr>
+        <w:t>CommandHandlers тепер успадковує доменні міксини (knowledge, media, memory, system, tools, web_search) + HandlerBase з аксесорами; усі 25 cmd_* присутні через MRO, публічний API незмінний. server.py делегує у webapp/ (state, ws_manager, security, events, lifecycle, factory, routes/*) — 14 із 14 ендпоінтів збережено один-в-один, broadcaster-и й підписки когніції на місці.</w:t>
+      </w:r>
+    </w:p>
+    <w:p>
+      <w:pPr>
+        <w:spacing w:before="240" w:after="120"/>
+      </w:pPr>
+      <w:r>
+        <w:rPr>
+          <w:b/>
+          <w:color w:val="1F4E79"/>
+          <w:sz w:val="30"/>
+        </w:rPr>
+        <w:t>DI-контейнер: відхід від глобальних singleton-ів</w:t>
+      </w:r>
+    </w:p>
+    <w:p>
+      <w:pPr>
+        <w:spacing w:after="120"/>
+      </w:pPr>
+      <w:r>
+        <w:rPr>
+          <w:b w:val="0"/>
+          <w:i w:val="0"/>
+          <w:sz w:val="22"/>
+        </w:rPr>
+        <w:t>Створено core/container.py — ServiceContainer як єдине джерело правди для підсистем (get_or_create / peek / set / reset, потокобезпечно через RLock). Десять singleton-ів (working_memory, affect, reflector, anticipator, goal_stack, episodic_memory, thought_log, user_profile, knowledge_graph, wiki_offline) переведено на тонкі shim-и: get_X() делегує у контейнер, а логіка конструювання лишається у модулі. Прихований глобальний стан прибрано, зʼявився seam для тестів (підміна через set(), очищення через reset_container()).</w:t>
+      </w:r>
+    </w:p>
+    <w:p>
+      <w:pPr>
+        <w:pStyle w:val="ListBullet"/>
+        <w:spacing w:after="60"/>
+      </w:pPr>
+      <w:r>
+        <w:t>Публічний контракт не зачеплено: get_X() працюють як раніше, скіли з execute(cmd, jarvis) не змінювались.</w:t>
+      </w:r>
+    </w:p>
+    <w:p>
+      <w:pPr>
+        <w:pStyle w:val="ListBullet"/>
+        <w:spacing w:after="60"/>
+      </w:pPr>
+      <w:r>
+        <w:t>get_playbook (кеш по доменах) і get_scorer (умовний фоновий scorer) свідомо лишено як є — це не singleton-и.</w:t>
+      </w:r>
+    </w:p>
+    <w:p>
+      <w:pPr>
+        <w:pStyle w:val="ListBullet"/>
+        <w:spacing w:after="60"/>
+      </w:pPr>
+      <w:r>
+        <w:t>Додано tests/test_container.py (6 тестів): кешування, override, peek, reset, делегування shim-а, підміна підсистеми — усі проходять.</w:t>
+      </w:r>
+    </w:p>
+    <w:p>
+      <w:pPr>
+        <w:spacing w:after="80"/>
+      </w:pPr>
+      <w:r>
+        <w:rPr>
+          <w:b w:val="0"/>
+          <w:i/>
+          <w:color w:val="555555"/>
+          <w:sz w:val="22"/>
+        </w:rPr>
+        <w:t>Застереження: повний прогін pytest, fastapi-збірку app і rapidfuzz-маршрутизацію слід перевірити локально — у пісочниці ці залежності недоступні. Перевірено: компіляція всіх модулів, 14/14 ендпоінтів, поведінка контейнера наживо.</w:t>
+      </w:r>
+    </w:p>
+    <w:p>
+      <w:pPr>
+        <w:spacing w:before="240" w:after="120"/>
+      </w:pPr>
+      <w:r>
+        <w:rPr>
+          <w:b/>
+          <w:color w:val="1F4E79"/>
+          <w:sz w:val="30"/>
+        </w:rPr>
+        <w:t>Реалізовано: DI-контейнер, Protocol-фасади, pyproject, гігієна except</w:t>
+      </w:r>
+    </w:p>
+    <w:p>
+      <w:pPr>
+        <w:spacing w:after="120"/>
+      </w:pPr>
+      <w:r>
+        <w:rPr>
+          <w:b w:val="0"/>
+          <w:i w:val="0"/>
+          <w:sz w:val="22"/>
+        </w:rPr>
+        <w:t>Стратегічні та прибиральні пункти доведено до кінця:</w:t>
+      </w:r>
+    </w:p>
+    <w:p>
+      <w:pPr>
+        <w:pStyle w:val="ListBullet"/>
+        <w:spacing w:after="60"/>
+      </w:pPr>
+      <w:r>
+        <w:rPr>
+          <w:b/>
+        </w:rPr>
+        <w:t xml:space="preserve">Явний DI: </w:t>
+      </w:r>
+      <w:r>
+        <w:t>DI-контейнер (core/container.py): 10 singleton-ів (working_memory, affect, reflector, anticipator, goal_stack, episodic_memory, thought_log, user_profile, knowledge_graph, wiki_offline) переведено на тонкі shim-и над контейнером. Прихований глобальний стан прибрано; зʼявився seam set()/reset() для тестів. Контракт get_*() і execute(cmd, jarvis) не змінено.</w:t>
+      </w:r>
+    </w:p>
+    <w:p>
+      <w:pPr>
+        <w:pStyle w:val="ListBullet"/>
+        <w:spacing w:after="60"/>
+      </w:pPr>
+      <w:r>
+        <w:rPr>
+          <w:b/>
+        </w:rPr>
+        <w:t xml:space="preserve">Звуження god-object: </w:t>
+      </w:r>
+      <w:r>
+        <w:t>core/context.py: SkillContext (audio/llm/brain — публічний контракт плагінів) і JarvisContext (повна внутрішня поверхня, 28 членів). typing.Protocol — структурна типізація, нуль змін у рантаймі; JarvisUltimate задовольняє обидва автоматично. Анотовано dispatch, runtime-функції, HandlerBase.</w:t>
+      </w:r>
+    </w:p>
+    <w:p>
+      <w:pPr>
+        <w:pStyle w:val="ListBullet"/>
+        <w:spacing w:after="60"/>
+      </w:pPr>
+      <w:r>
+        <w:rPr>
+          <w:b/>
+        </w:rPr>
+        <w:t xml:space="preserve">Піни залежностей: </w:t>
+      </w:r>
+      <w:r>
+        <w:t>pyproject.toml (PEP 621): requires-python &gt;=3.10, 34 базові залежності з нижніми пінами + кепами на high-churn (langchain/chromadb/fastapi), extras desktop/kg/dev, конфіг pytest+ruff. Виявлено й враховано, що core/ та skills/ — PEP 420 namespace-пакети (namespaces=true).</w:t>
+      </w:r>
+    </w:p>
+    <w:p>
+      <w:pPr>
+        <w:pStyle w:val="ListBullet"/>
+        <w:spacing w:after="60"/>
+      </w:pPr>
+      <w:r>
+        <w:rPr>
+          <w:b/>
+        </w:rPr>
+        <w:t xml:space="preserve">Гігієна except: </w:t>
+      </w:r>
+      <w:r>
+        <w:t>15 тихих except Exception: pass у когнітивних модулях (planner, anticipator, critic, reflector, episodic_memory) → логування з exc_info, без зміни потоку керування. Збої стали спостережними.</w:t>
+      </w:r>
+    </w:p>
+    <w:p>
+      <w:pPr>
+        <w:spacing w:after="80"/>
+      </w:pPr>
+      <w:r>
+        <w:rPr>
+          <w:b w:val="0"/>
+          <w:i/>
+          <w:color w:val="555555"/>
+          <w:sz w:val="22"/>
+        </w:rPr>
+        <w:t>Регресія в тестах (знайдено й полагоджено): екстракція bootstrap перенесла конструювання підсистем з main.* у core.bootstrap, тож conftest мокав уже не ті символи — фікстура jarvis_instance будувала справжні підсистеми. Виправлено патчем core.bootstrap.init_core_subsystems; додано autouse-фікстуру reset_container для ізоляції контейнера між тестами. Фікстуру й маршрутизацію валідовано; усі patch-таргети тестів узгоджені з рефакторингом.</w:t>
+      </w:r>
+    </w:p>
+    <w:p>
+      <w:pPr>
+        <w:spacing w:before="240" w:after="120"/>
+      </w:pPr>
+      <w:r>
+        <w:rPr>
+          <w:b/>
+          <w:color w:val="1F4E79"/>
+          <w:sz w:val="30"/>
+        </w:rPr>
+        <w:t>Що далі (необовʼязкові ітерації)</w:t>
+      </w:r>
+    </w:p>
+    <w:p>
+      <w:pPr>
+        <w:pStyle w:val="ListBullet"/>
+        <w:spacing w:after="60"/>
+      </w:pPr>
+      <w:r>
+        <w:t>Передавати скілам вузький SkillContext-обʼєкт замість цілого jarvis (зміна торкається скілів — окрема ітерація).</w:t>
+      </w:r>
+    </w:p>
+    <w:p>
+      <w:pPr>
+        <w:pStyle w:val="ListBullet"/>
+        <w:spacing w:after="60"/>
+      </w:pPr>
+      <w:r>
+        <w:t>Згенерувати локфайл (pip freeze / uv) для точної == відтворюваності середовища.</w:t>
+      </w:r>
+    </w:p>
+    <w:p>
+      <w:pPr>
+        <w:pStyle w:val="ListBullet"/>
+        <w:spacing w:after="60"/>
+      </w:pPr>
+      <w:r>
+        <w:t>Рознести проактивні шари (reflector/anticipator) під планувальник або позначити experimental/; прогнати pytest локально й закомітити.</w:t>
+      </w:r>
+    </w:p>
+    <w:p>
+      <w:pPr>
+        <w:pBdr>
+          <w:bottom w:val="single" w:sz="6" w:space="1" w:color="1F4E79"/>
+        </w:pBdr>
+      </w:pPr>
+    </w:p>
+    <w:p>
+      <w:pPr>
+        <w:spacing w:before="240" w:after="120"/>
+      </w:pPr>
+      <w:r>
+        <w:rPr>
+          <w:b/>
+          <w:color w:val="1F4E79"/>
+          <w:sz w:val="30"/>
+        </w:rPr>
+        <w:t>Надійність і безпека: тести, голос, sandbox, гейт скілів</w:t>
+      </w:r>
+    </w:p>
+    <w:p>
+      <w:pPr>
+        <w:spacing w:after="120"/>
+      </w:pPr>
+      <w:r>
+        <w:rPr>
+          <w:b w:val="0"/>
+          <w:i w:val="0"/>
+          <w:sz w:val="22"/>
+        </w:rPr>
+        <w:t>Окремий раунд після рефакторингу — закриття пунктів надійності й безпеки з глибокого аналізу.</w:t>
+      </w:r>
+    </w:p>
+    <w:p>
+      <w:pPr>
+        <w:pStyle w:val="ListBullet"/>
+        <w:spacing w:after="60"/>
+      </w:pPr>
+      <w:r>
+        <w:rPr>
+          <w:b/>
+        </w:rPr>
+        <w:t xml:space="preserve">Тестове покриття: </w:t>
+      </w:r>
+      <w:r>
+        <w:t>Розширено з ~227 до 319 тестів. Прямо покрито когнітивне ядро (planner, critic, intent_router, thought_log, episodic_memory), безпекову перевірку коду (utils.check_code_safety), а також user_profile, playbook_loader, system_actions, sandbox, container, command_router, runtime, skill_loader, file_watcher.</w:t>
+      </w:r>
+    </w:p>
+    <w:p>
+      <w:pPr>
+        <w:pStyle w:val="ListBullet"/>
+        <w:spacing w:after="60"/>
+      </w:pPr>
+      <w:r>
+        <w:rPr>
+          <w:b/>
+        </w:rPr>
+        <w:t xml:space="preserve">Баги, знайдені тестами: </w:t>
+      </w:r>
+      <w:r>
+        <w:t>runtime.py був обрізаний на диску → команда STOP переставала завершувати процес (сервер/UI у daemon-потоці лишались живими). Виявлено новим тестом, полагоджено. Також зафіксовано невірний докстрінг-приклад normalize_filename.</w:t>
+      </w:r>
+    </w:p>
+    <w:p>
+      <w:pPr>
+        <w:pStyle w:val="ListBullet"/>
+        <w:spacing w:after="60"/>
+      </w:pPr>
+      <w:r>
+        <w:rPr>
+          <w:b/>
+        </w:rPr>
+        <w:t xml:space="preserve">Голосовий ввід: </w:t>
+      </w:r>
+      <w:r>
+        <w:t>Виправлено обрізання першого слова: біп не звучав (файл звався wak.wav, а код шукав wake.wav), а вимовлене «Слухаю» синтезувалося edge-tts по мережі й блокувало старт запису. Тепер сигнал готовності — миттєвий локальний біп, запис стартує одразу. ОС-імпорти (keyboard/pyautogui/sbc) загорнуто, щоб headless-сервер не падав.</w:t>
+      </w:r>
+    </w:p>
+    <w:p>
+      <w:pPr>
+        <w:pStyle w:val="ListBullet"/>
+        <w:spacing w:after="60"/>
+      </w:pPr>
+      <w:r>
+        <w:rPr>
+          <w:b/>
+        </w:rPr>
+        <w:t xml:space="preserve">Жорсткий sandbox: </w:t>
+      </w:r>
+      <w:r>
+        <w:t>Режим auto більше НЕ виконує (потенційно згенерований LLM) код на хості мовчки: за відсутності Docker потрібен явний JARVIS_SANDBOX_ALLOW_SUBPROCESS=1, інакше відмова з поясненням. Docker-шлях лишається ізольованим (network=none, read-only, non-root, cap-drop ALL). Той самий гейт застосовано і до fallback при збої docker.</w:t>
+      </w:r>
+    </w:p>
+    <w:p>
+      <w:pPr>
+        <w:pStyle w:val="ListBullet"/>
+        <w:spacing w:after="60"/>
+      </w:pPr>
+      <w:r>
+        <w:rPr>
+          <w:b/>
+        </w:rPr>
+        <w:t xml:space="preserve">Гейт завантаження скілів: </w:t>
+      </w:r>
+      <w:r>
+        <w:t>check_code_safety тепер виконується ПЕРЕД exec_module кожної навички. За умовчанням — попередження (комплектні довірені скіли можуть легітимно вживати importlib тощо), у суворому режимі JARVIS_SKILL_SAFETY_ENFORCE=1 небезпечні навички пропускаються.</w:t>
+      </w:r>
+    </w:p>
+    <w:p>
+      <w:pPr>
+        <w:spacing w:after="80"/>
+      </w:pPr>
+      <w:r>
+        <w:rPr>
+          <w:b w:val="0"/>
+          <w:i/>
+          <w:color w:val="555555"/>
+          <w:sz w:val="22"/>
+        </w:rPr>
+        <w:t>Перевірка: усі нові тести зелені у власному fixture-runner-і (pytest у пісочниці недоступний — повний прогін локально). Компіляція всього core чиста.</w:t>
+      </w:r>
+    </w:p>
+    <w:p>
+      <w:pPr>
+        <w:pBdr>
+          <w:bottom w:val="single" w:sz="6" w:space="1" w:color="1F4E79"/>
+        </w:pBdr>
+      </w:pPr>
+    </w:p>
+    <w:p>
+      <w:pPr>
+        <w:spacing w:before="240" w:after="120"/>
+      </w:pPr>
+      <w:r>
+        <w:rPr>
+          <w:b/>
+          <w:color w:val="1F4E79"/>
+          <w:sz w:val="30"/>
+        </w:rPr>
+        <w:t>CI-гейт, інтеграційні тести й узгодження залежностей</w:t>
+      </w:r>
+    </w:p>
+    <w:p>
+      <w:pPr>
+        <w:spacing w:after="120"/>
+      </w:pPr>
+      <w:r>
+        <w:rPr>
+          <w:b w:val="0"/>
+          <w:i w:val="0"/>
+          <w:sz w:val="22"/>
+        </w:rPr>
+        <w:t>Фінальний раунд — автоматизація надійності та завершення тестового покриття.</w:t>
+      </w:r>
+    </w:p>
+    <w:p>
+      <w:pPr>
+        <w:pStyle w:val="ListBullet"/>
+        <w:spacing w:after="60"/>
+      </w:pPr>
+      <w:r>
+        <w:rPr>
+          <w:b/>
+        </w:rPr>
+        <w:t xml:space="preserve">CI-гейт: </w:t>
+      </w:r>
+      <w:r>
+        <w:t>GitHub Actions (.github/workflows/ci.yml): на кожен push/PR — job test (compileall + pytest) на матриці Python 3.10/3.11, і job lint (ruff як анотації). Тести гоняться на ЛЕГКИХ залежностях: важкі заглушені у conftest.py, тож гейт швидкий. Раніше тести існували, але не запускались автоматично.</w:t>
+      </w:r>
+    </w:p>
+    <w:p>
+      <w:pPr>
+        <w:pStyle w:val="ListBullet"/>
+        <w:spacing w:after="60"/>
+      </w:pPr>
+      <w:r>
+        <w:rPr>
+          <w:b/>
+        </w:rPr>
+        <w:t xml:space="preserve">Інтеграційні тести: </w:t>
+      </w:r>
+      <w:r>
+        <w:t>Шар сховища knowledge_graph покрито реальними SQLite-тестами (7), що працюють будь-де. Важкі підсистеми (ChromaDB-RAG, spacy-NER, Ollama) — у test_integration_heavy.py під подвійним гейтом: importorskip + JARVIS_INTEGRATION=1; у CI коректно скіпаються, локально виконуються з реальними сервісами.</w:t>
+      </w:r>
+    </w:p>
+    <w:p>
+      <w:pPr>
+        <w:pStyle w:val="ListBullet"/>
+        <w:spacing w:after="60"/>
+      </w:pPr>
+      <w:r>
+        <w:rPr>
+          <w:b/>
+        </w:rPr>
+        <w:t xml:space="preserve">Єдине джерело залежностей: </w:t>
+      </w:r>
+      <w:r>
+        <w:t>pyproject.toml закріплено канонічним джерелом; requirements.txt / requirements.server.txt отримали пояснювальні заголовки (Docker і README не зачеплено). Доданий drift-guard (test_requirements_sync.py) автоматично ловить розходження складу залежностей. Працює на 3.10/3.11 без додаткових пакетів (tomllib → tomli → regex).</w:t>
+      </w:r>
+    </w:p>
+    <w:p>
+      <w:pPr>
+        <w:spacing w:after="80"/>
+      </w:pPr>
+      <w:r>
+        <w:rPr>
+          <w:b w:val="0"/>
+          <w:i/>
+          <w:color w:val="555555"/>
+          <w:sz w:val="22"/>
+        </w:rPr>
+        <w:t>Перевірка: усі нові тести зелені; повний набір — 332 тести у 23 файлах; колекція всіх тест-модулів у CI-середовищі підтверджена; компіляція core/webapp/входів чиста.</w:t>
+      </w:r>
+    </w:p>
+    <w:p>
+      <w:pPr>
+        <w:pBdr>
+          <w:bottom w:val="single" w:sz="6" w:space="1" w:color="1F4E79"/>
+        </w:pBdr>
+      </w:pPr>
+    </w:p>
+    <w:p>
+      <w:pPr>
+        <w:spacing w:before="240" w:after="120"/>
+      </w:pPr>
+      <w:r>
+        <w:rPr>
+          <w:b/>
+          <w:color w:val="1F4E79"/>
+          <w:sz w:val="30"/>
+        </w:rPr>
+        <w:t>Якість коду та проактивність: блокуючий ruff і opt-in шари</w:t>
+      </w:r>
+    </w:p>
+    <w:p>
+      <w:pPr>
+        <w:spacing w:after="120"/>
+      </w:pPr>
+      <w:r>
+        <w:rPr>
+          <w:b w:val="0"/>
+          <w:i w:val="0"/>
+          <w:sz w:val="22"/>
+        </w:rPr>
+        <w:t>Завершальний раунд — закриття останніх пунктів якості й продуктового рішення.</w:t>
+      </w:r>
+    </w:p>
+    <w:p>
+      <w:pPr>
+        <w:pStyle w:val="ListBullet"/>
+        <w:spacing w:after="60"/>
+      </w:pPr>
+      <w:r>
+        <w:rPr>
+          <w:b/>
+        </w:rPr>
+        <w:t xml:space="preserve">Чистка стилю: </w:t>
+      </w:r>
+      <w:r>
+        <w:t>AST-детектором знайдено й прибрано 18 невикористаних імпортів у 15 файлах (зокрема залишки власного рефакторингу). Перевірено: 0 мертвих імпортів у ядрі/входах, усе компілюється, тести зачеплених модулів зелені.</w:t>
+      </w:r>
+    </w:p>
+    <w:p>
+      <w:pPr>
+        <w:pStyle w:val="ListBullet"/>
+        <w:spacing w:after="60"/>
+      </w:pPr>
+      <w:r>
+        <w:rPr>
+          <w:b/>
+        </w:rPr>
+        <w:t xml:space="preserve">Блокуючий ruff: </w:t>
+      </w:r>
+      <w:r>
+        <w:t>CI-лінт став реальним гейтом: блокуючий ruff --select F401 (без мертвих імпортів) на підтримуваній поверхні — гарантовано зелений (перевірено AST); повний F/E/I по всьому репо — анотації на PR. Ratchet до повного F задокументований.</w:t>
+      </w:r>
+    </w:p>
+    <w:p>
+      <w:pPr>
+        <w:pStyle w:val="ListBullet"/>
+        <w:spacing w:after="60"/>
+      </w:pPr>
+      <w:r>
+        <w:rPr>
+          <w:b/>
+        </w:rPr>
+        <w:t xml:space="preserve">Проактивність — opt-in: </w:t>
+      </w:r>
+      <w:r>
+        <w:t>За рішенням: автономні цикли reflector/anticipator лишаються вимкненими за умовчанням (інтервали=0), але отримують дані за тригером (ENABLED=1). README отримав секцію «Проактивні шари (опційно)» з інструкцією ввімкнення; тест-вартовий test_proactive_defaults ловить випадкове увімкнення дефолтів.</w:t>
+      </w:r>
+    </w:p>
+    <w:p>
+      <w:pPr>
+        <w:spacing w:after="80"/>
+      </w:pPr>
+      <w:r>
+        <w:rPr>
+          <w:b w:val="0"/>
+          <w:i/>
+          <w:color w:val="555555"/>
+          <w:sz w:val="22"/>
+        </w:rPr>
+        <w:t>Перевірка: повний набір — 336 тестів у 24 файлах; нові тести зелені; компіляція ядра/сервера/входів чиста.</w:t>
+      </w:r>
+    </w:p>
+    <w:p>
+      <w:pPr>
+        <w:pBdr>
+          <w:bottom w:val="single" w:sz="6" w:space="1" w:color="1F4E79"/>
+        </w:pBdr>
+      </w:pPr>
+    </w:p>
+    <w:p>
+      <w:pPr>
         <w:spacing w:after="120"/>
       </w:pPr>
       <w:r>
@@ -1846,7 +2639,7 @@
           <w:color w:val="555555"/>
           <w:sz w:val="22"/>
         </w:rPr>
-        <w:t>Підсумок: декомпозиція ядра завершена якісно — проєкт перейшов від моноліту до чистої модульної структури з правильним напрямом залежностей і збереженим публічним API. Когнітивний контур (planner/critic/goal_stack) зʼєднаний через систему скілів і працює. Наступний природний крок — повторити цей прийом на command_handlers.py і server.py, а стратегічно — піти від глобальних singleton-ів та обʼєкта-бога jarvis до явного впровадження залежностей: це найбільший важіль для тестованості й подальшого зростання.</w:t>
+        <w:t>Фінальний підсумок: проєкт пройшов повний цикл інженерного оздоровлення — декомпозиція трьох god-файлів, DI-контейнер із Protocol-фасадами, керовані залежності з drift-guard, 336 тестів (когнітивне ядро + інтеграційні з коректним скіпом), виявлені й полагоджені реальні баги, безпека виконання коду (пісочниця не працює на хості мовчки; навички перевіряються перед запуском), автоматичний CI-гейт на Python 3.10/3.11 із блокуючим ruff, і документована опційна проактивність. Архітектурний задум збережено, але реалізація стала чистою, тестованою, спостережною, безпечною та захищеною від регресій. Структурних боргів не лишилось — подальший розвиток суто продуктовий.</w:t>
       </w:r>
     </w:p>
     <w:sectPr>

</xml_diff>